<commit_message>
Refresh Bangladesh workshop materials and add live team challenges
Use the separately attached Rev.3 and Rev.3.1 agendas, replace the participant handouts and protected teaching set, and add five session-linked games plus the locked cross-device facilitator board. Exclude the rejected old PDF and remove hardcoded login identifiers from public code.
</commit_message>
<xml_diff>
--- a/dist/downloads/A3519988/A3519988_H2.1_Conduct_and_ethics_scenarios.docx
+++ b/dist/downloads/A3519988/A3519988_H2.1_Conduct_and_ethics_scenarios.docx
@@ -29,7 +29,7 @@
           <w:color w:val="0E2841"/>
           <w:sz w:val="32"/>
         </w:rPr>
-        <w:t>Conduct and ethics scenarios</w:t>
+        <w:t>Conduct and ethics scenarios, and the secretariat models comparison</w:t>
       </w:r>
     </w:p>
     <w:p>
@@ -1730,6 +1730,575 @@
         <w:spacing w:after="40"/>
       </w:pPr>
     </w:p>
+    <w:p>
+      <w:r>
+        <w:br w:type="page"/>
+      </w:r>
+    </w:p>
+    <w:p>
+      <w:pPr>
+        <w:spacing w:before="0" w:after="60"/>
+      </w:pPr>
+      <w:r>
+        <w:rPr>
+          <w:rFonts w:ascii="Calibri" w:hAnsi="Calibri"/>
+          <w:b/>
+          <w:i w:val="0"/>
+          <w:color w:val="0D6652"/>
+          <w:sz w:val="28"/>
+        </w:rPr>
+        <w:t>Your own secretariat, against the two models</w:t>
+      </w:r>
+    </w:p>
+    <w:p>
+      <w:pPr>
+        <w:spacing w:before="0" w:after="120"/>
+      </w:pPr>
+      <w:r>
+        <w:rPr>
+          <w:rFonts w:ascii="Calibri" w:hAnsi="Calibri"/>
+          <w:b w:val="0"/>
+          <w:i/>
+          <w:color w:val="595959"/>
+          <w:sz w:val="20"/>
+        </w:rPr>
+        <w:t>The session compares two secretariat arrangements: one housed inside the ministry, with the operational programmes carried by a joint entity owned by the tripartite partners; and one established as an autonomous statutory body with its own budget line and an executive director appointed by the council. Neither is a target. Use them to see what is missing in your own.</w:t>
+      </w:r>
+    </w:p>
+    <w:tbl>
+      <w:tblPr>
+        <w:tblStyle w:val="TableGrid"/>
+        <w:tblW w:type="auto" w:w="0"/>
+        <w:jc w:val="left"/>
+        <w:tblLook w:firstColumn="1" w:firstRow="1" w:lastColumn="0" w:lastRow="0" w:noHBand="0" w:noVBand="1" w:val="04A0"/>
+      </w:tblPr>
+      <w:tblGrid>
+        <w:gridCol w:w="2520"/>
+        <w:gridCol w:w="2520"/>
+        <w:gridCol w:w="2520"/>
+        <w:gridCol w:w="2520"/>
+      </w:tblGrid>
+      <w:tr>
+        <w:tc>
+          <w:tcPr>
+            <w:tcW w:type="dxa" w:w="3600"/>
+            <w:shd w:val="clear" w:color="auto" w:fill="0D6652"/>
+          </w:tcPr>
+          <w:p>
+            <w:pPr>
+              <w:spacing w:before="20" w:after="40"/>
+            </w:pPr>
+            <w:r>
+              <w:rPr>
+                <w:rFonts w:ascii="Calibri" w:hAnsi="Calibri"/>
+                <w:b/>
+                <w:i w:val="0"/>
+                <w:color w:val="FFFFFF"/>
+                <w:sz w:val="19"/>
+              </w:rPr>
+              <w:t>Feature</w:t>
+            </w:r>
+          </w:p>
+        </w:tc>
+        <w:tc>
+          <w:tcPr>
+            <w:tcW w:type="dxa" w:w="2304"/>
+            <w:shd w:val="clear" w:color="auto" w:fill="0D6652"/>
+          </w:tcPr>
+          <w:p>
+            <w:pPr>
+              <w:spacing w:before="20" w:after="40"/>
+            </w:pPr>
+            <w:r>
+              <w:rPr>
+                <w:rFonts w:ascii="Calibri" w:hAnsi="Calibri"/>
+                <w:b/>
+                <w:i w:val="0"/>
+                <w:color w:val="FFFFFF"/>
+                <w:sz w:val="19"/>
+              </w:rPr>
+              <w:t>In your institution today</w:t>
+            </w:r>
+          </w:p>
+        </w:tc>
+        <w:tc>
+          <w:tcPr>
+            <w:tcW w:type="dxa" w:w="2592"/>
+            <w:shd w:val="clear" w:color="auto" w:fill="0D6652"/>
+          </w:tcPr>
+          <w:p>
+            <w:pPr>
+              <w:spacing w:before="20" w:after="40"/>
+            </w:pPr>
+            <w:r>
+              <w:rPr>
+                <w:rFonts w:ascii="Calibri" w:hAnsi="Calibri"/>
+                <w:b/>
+                <w:i w:val="0"/>
+                <w:color w:val="FFFFFF"/>
+                <w:sz w:val="19"/>
+              </w:rPr>
+              <w:t>What it would take to have it</w:t>
+            </w:r>
+          </w:p>
+        </w:tc>
+        <w:tc>
+          <w:tcPr>
+            <w:tcW w:type="dxa" w:w="1296"/>
+            <w:shd w:val="clear" w:color="auto" w:fill="0D6652"/>
+          </w:tcPr>
+          <w:p>
+            <w:pPr>
+              <w:spacing w:before="20" w:after="40"/>
+            </w:pPr>
+            <w:r>
+              <w:rPr>
+                <w:rFonts w:ascii="Calibri" w:hAnsi="Calibri"/>
+                <w:b/>
+                <w:i w:val="0"/>
+                <w:color w:val="FFFFFF"/>
+                <w:sz w:val="19"/>
+              </w:rPr>
+              <w:t>Whose agreement is needed</w:t>
+            </w:r>
+          </w:p>
+        </w:tc>
+      </w:tr>
+      <w:tr>
+        <w:trPr>
+          <w:trHeight w:val="720"/>
+        </w:trPr>
+        <w:tc>
+          <w:tcPr>
+            <w:tcW w:type="dxa" w:w="3600"/>
+          </w:tcPr>
+          <w:p>
+            <w:pPr>
+              <w:spacing w:before="20" w:after="20"/>
+            </w:pPr>
+            <w:r>
+              <w:rPr>
+                <w:rFonts w:ascii="Calibri" w:hAnsi="Calibri"/>
+                <w:b w:val="0"/>
+                <w:i w:val="0"/>
+                <w:sz w:val="19"/>
+              </w:rPr>
+              <w:t>A named budget line for the secretariat’s own operating costs</w:t>
+            </w:r>
+          </w:p>
+        </w:tc>
+        <w:tc>
+          <w:tcPr>
+            <w:tcW w:type="dxa" w:w="2304"/>
+          </w:tcPr>
+          <w:p/>
+        </w:tc>
+        <w:tc>
+          <w:tcPr>
+            <w:tcW w:type="dxa" w:w="2592"/>
+          </w:tcPr>
+          <w:p/>
+        </w:tc>
+        <w:tc>
+          <w:tcPr>
+            <w:tcW w:type="dxa" w:w="1296"/>
+          </w:tcPr>
+          <w:p/>
+        </w:tc>
+      </w:tr>
+      <w:tr>
+        <w:trPr>
+          <w:trHeight w:val="720"/>
+        </w:trPr>
+        <w:tc>
+          <w:tcPr>
+            <w:tcW w:type="dxa" w:w="3600"/>
+            <w:shd w:val="clear" w:color="auto" w:fill="F4F6F5"/>
+          </w:tcPr>
+          <w:p>
+            <w:pPr>
+              <w:spacing w:before="20" w:after="20"/>
+            </w:pPr>
+            <w:r>
+              <w:rPr>
+                <w:rFonts w:ascii="Calibri" w:hAnsi="Calibri"/>
+                <w:b w:val="0"/>
+                <w:i w:val="0"/>
+                <w:sz w:val="19"/>
+              </w:rPr>
+              <w:t>A technical function identified by name — somebody whose job includes evidence work</w:t>
+            </w:r>
+          </w:p>
+        </w:tc>
+        <w:tc>
+          <w:tcPr>
+            <w:tcW w:type="dxa" w:w="2304"/>
+            <w:shd w:val="clear" w:color="auto" w:fill="F4F6F5"/>
+          </w:tcPr>
+          <w:p/>
+        </w:tc>
+        <w:tc>
+          <w:tcPr>
+            <w:tcW w:type="dxa" w:w="2592"/>
+            <w:shd w:val="clear" w:color="auto" w:fill="F4F6F5"/>
+          </w:tcPr>
+          <w:p/>
+        </w:tc>
+        <w:tc>
+          <w:tcPr>
+            <w:tcW w:type="dxa" w:w="1296"/>
+            <w:shd w:val="clear" w:color="auto" w:fill="F4F6F5"/>
+          </w:tcPr>
+          <w:p/>
+        </w:tc>
+      </w:tr>
+      <w:tr>
+        <w:trPr>
+          <w:trHeight w:val="720"/>
+        </w:trPr>
+        <w:tc>
+          <w:tcPr>
+            <w:tcW w:type="dxa" w:w="3600"/>
+          </w:tcPr>
+          <w:p>
+            <w:pPr>
+              <w:spacing w:before="20" w:after="20"/>
+            </w:pPr>
+            <w:r>
+              <w:rPr>
+                <w:rFonts w:ascii="Calibri" w:hAnsi="Calibri"/>
+                <w:b w:val="0"/>
+                <w:i w:val="0"/>
+                <w:sz w:val="19"/>
+              </w:rPr>
+              <w:t>An officer who follows each standing subject across years</w:t>
+            </w:r>
+          </w:p>
+        </w:tc>
+        <w:tc>
+          <w:tcPr>
+            <w:tcW w:type="dxa" w:w="2304"/>
+          </w:tcPr>
+          <w:p/>
+        </w:tc>
+        <w:tc>
+          <w:tcPr>
+            <w:tcW w:type="dxa" w:w="2592"/>
+          </w:tcPr>
+          <w:p/>
+        </w:tc>
+        <w:tc>
+          <w:tcPr>
+            <w:tcW w:type="dxa" w:w="1296"/>
+          </w:tcPr>
+          <w:p/>
+        </w:tc>
+      </w:tr>
+      <w:tr>
+        <w:trPr>
+          <w:trHeight w:val="720"/>
+        </w:trPr>
+        <w:tc>
+          <w:tcPr>
+            <w:tcW w:type="dxa" w:w="3600"/>
+            <w:shd w:val="clear" w:color="auto" w:fill="F4F6F5"/>
+          </w:tcPr>
+          <w:p>
+            <w:pPr>
+              <w:spacing w:before="20" w:after="20"/>
+            </w:pPr>
+            <w:r>
+              <w:rPr>
+                <w:rFonts w:ascii="Calibri" w:hAnsi="Calibri"/>
+                <w:b w:val="0"/>
+                <w:i w:val="0"/>
+                <w:sz w:val="19"/>
+              </w:rPr>
+              <w:t>A written statement, agreed by the body, of what the secretariat does and does not do</w:t>
+            </w:r>
+          </w:p>
+        </w:tc>
+        <w:tc>
+          <w:tcPr>
+            <w:tcW w:type="dxa" w:w="2304"/>
+            <w:shd w:val="clear" w:color="auto" w:fill="F4F6F5"/>
+          </w:tcPr>
+          <w:p/>
+        </w:tc>
+        <w:tc>
+          <w:tcPr>
+            <w:tcW w:type="dxa" w:w="2592"/>
+            <w:shd w:val="clear" w:color="auto" w:fill="F4F6F5"/>
+          </w:tcPr>
+          <w:p/>
+        </w:tc>
+        <w:tc>
+          <w:tcPr>
+            <w:tcW w:type="dxa" w:w="1296"/>
+            <w:shd w:val="clear" w:color="auto" w:fill="F4F6F5"/>
+          </w:tcPr>
+          <w:p/>
+        </w:tc>
+      </w:tr>
+      <w:tr>
+        <w:trPr>
+          <w:trHeight w:val="720"/>
+        </w:trPr>
+        <w:tc>
+          <w:tcPr>
+            <w:tcW w:type="dxa" w:w="3600"/>
+          </w:tcPr>
+          <w:p>
+            <w:pPr>
+              <w:spacing w:before="20" w:after="20"/>
+            </w:pPr>
+            <w:r>
+              <w:rPr>
+                <w:rFonts w:ascii="Calibri" w:hAnsi="Calibri"/>
+                <w:b w:val="0"/>
+                <w:i w:val="0"/>
+                <w:sz w:val="19"/>
+              </w:rPr>
+              <w:t>Authority to receive or administer external research support</w:t>
+            </w:r>
+          </w:p>
+        </w:tc>
+        <w:tc>
+          <w:tcPr>
+            <w:tcW w:type="dxa" w:w="2304"/>
+          </w:tcPr>
+          <w:p/>
+        </w:tc>
+        <w:tc>
+          <w:tcPr>
+            <w:tcW w:type="dxa" w:w="2592"/>
+          </w:tcPr>
+          <w:p/>
+        </w:tc>
+        <w:tc>
+          <w:tcPr>
+            <w:tcW w:type="dxa" w:w="1296"/>
+          </w:tcPr>
+          <w:p/>
+        </w:tc>
+      </w:tr>
+      <w:tr>
+        <w:trPr>
+          <w:trHeight w:val="720"/>
+        </w:trPr>
+        <w:tc>
+          <w:tcPr>
+            <w:tcW w:type="dxa" w:w="3600"/>
+            <w:shd w:val="clear" w:color="auto" w:fill="F4F6F5"/>
+          </w:tcPr>
+          <w:p>
+            <w:pPr>
+              <w:spacing w:before="20" w:after="20"/>
+            </w:pPr>
+            <w:r>
+              <w:rPr>
+                <w:rFonts w:ascii="Calibri" w:hAnsi="Calibri"/>
+                <w:b w:val="0"/>
+                <w:i w:val="0"/>
+                <w:sz w:val="19"/>
+              </w:rPr>
+              <w:t>An executive head who reports to the body rather than up a ministry line</w:t>
+            </w:r>
+          </w:p>
+        </w:tc>
+        <w:tc>
+          <w:tcPr>
+            <w:tcW w:type="dxa" w:w="2304"/>
+            <w:shd w:val="clear" w:color="auto" w:fill="F4F6F5"/>
+          </w:tcPr>
+          <w:p/>
+        </w:tc>
+        <w:tc>
+          <w:tcPr>
+            <w:tcW w:type="dxa" w:w="2592"/>
+            <w:shd w:val="clear" w:color="auto" w:fill="F4F6F5"/>
+          </w:tcPr>
+          <w:p/>
+        </w:tc>
+        <w:tc>
+          <w:tcPr>
+            <w:tcW w:type="dxa" w:w="1296"/>
+            <w:shd w:val="clear" w:color="auto" w:fill="F4F6F5"/>
+          </w:tcPr>
+          <w:p/>
+        </w:tc>
+      </w:tr>
+    </w:tbl>
+    <w:p>
+      <w:pPr>
+        <w:spacing w:after="40"/>
+      </w:pPr>
+    </w:p>
+    <w:p>
+      <w:pPr>
+        <w:spacing w:before="80" w:after="120"/>
+      </w:pPr>
+      <w:r>
+        <w:rPr>
+          <w:rFonts w:ascii="Calibri" w:hAnsi="Calibri"/>
+          <w:b w:val="0"/>
+          <w:i/>
+          <w:color w:val="E72F1F"/>
+          <w:sz w:val="20"/>
+        </w:rPr>
+        <w:t>Four of those six need nobody’s permission beyond the body itself. Mark which four, and carry them to your 30-day plan on Sunday.</w:t>
+      </w:r>
+    </w:p>
+    <w:tbl>
+      <w:tblPr>
+        <w:tblStyle w:val="TableGrid"/>
+        <w:tblW w:type="auto" w:w="0"/>
+        <w:jc w:val="left"/>
+        <w:tblLook w:firstColumn="1" w:firstRow="1" w:lastColumn="0" w:lastRow="0" w:noHBand="0" w:noVBand="1" w:val="04A0"/>
+      </w:tblPr>
+      <w:tblGrid>
+        <w:gridCol w:w="5040"/>
+        <w:gridCol w:w="5040"/>
+      </w:tblGrid>
+      <w:tr>
+        <w:tc>
+          <w:tcPr>
+            <w:tcW w:type="dxa" w:w="4608"/>
+            <w:shd w:val="clear" w:color="auto" w:fill="0D6652"/>
+          </w:tcPr>
+          <w:p>
+            <w:pPr>
+              <w:spacing w:before="20" w:after="40"/>
+            </w:pPr>
+            <w:r>
+              <w:rPr>
+                <w:rFonts w:ascii="Calibri" w:hAnsi="Calibri"/>
+                <w:b/>
+                <w:i w:val="0"/>
+                <w:color w:val="FFFFFF"/>
+                <w:sz w:val="19"/>
+              </w:rPr>
+            </w:r>
+          </w:p>
+        </w:tc>
+        <w:tc>
+          <w:tcPr>
+            <w:tcW w:type="dxa" w:w="5184"/>
+            <w:shd w:val="clear" w:color="auto" w:fill="0D6652"/>
+          </w:tcPr>
+          <w:p>
+            <w:pPr>
+              <w:spacing w:before="20" w:after="40"/>
+            </w:pPr>
+            <w:r>
+              <w:rPr>
+                <w:rFonts w:ascii="Calibri" w:hAnsi="Calibri"/>
+                <w:b/>
+                <w:i w:val="0"/>
+                <w:color w:val="FFFFFF"/>
+                <w:sz w:val="19"/>
+              </w:rPr>
+              <w:t>Your answer</w:t>
+            </w:r>
+          </w:p>
+        </w:tc>
+      </w:tr>
+      <w:tr>
+        <w:trPr>
+          <w:trHeight w:val="864"/>
+        </w:trPr>
+        <w:tc>
+          <w:tcPr>
+            <w:tcW w:type="dxa" w:w="4608"/>
+          </w:tcPr>
+          <w:p>
+            <w:pPr>
+              <w:spacing w:before="20" w:after="20"/>
+            </w:pPr>
+            <w:r>
+              <w:rPr>
+                <w:rFonts w:ascii="Calibri" w:hAnsi="Calibri"/>
+                <w:b w:val="0"/>
+                <w:i w:val="0"/>
+                <w:sz w:val="19"/>
+              </w:rPr>
+              <w:t>Which of the two models is closer to your arrangement today?</w:t>
+            </w:r>
+          </w:p>
+        </w:tc>
+        <w:tc>
+          <w:tcPr>
+            <w:tcW w:type="dxa" w:w="5184"/>
+          </w:tcPr>
+          <w:p/>
+        </w:tc>
+      </w:tr>
+      <w:tr>
+        <w:trPr>
+          <w:trHeight w:val="864"/>
+        </w:trPr>
+        <w:tc>
+          <w:tcPr>
+            <w:tcW w:type="dxa" w:w="4608"/>
+          </w:tcPr>
+          <w:p>
+            <w:pPr>
+              <w:spacing w:before="20" w:after="20"/>
+            </w:pPr>
+            <w:r>
+              <w:rPr>
+                <w:rFonts w:ascii="Calibri" w:hAnsi="Calibri"/>
+                <w:b w:val="0"/>
+                <w:i w:val="0"/>
+                <w:sz w:val="19"/>
+              </w:rPr>
+              <w:t>Which single feature of the other one would you want most?</w:t>
+            </w:r>
+          </w:p>
+        </w:tc>
+        <w:tc>
+          <w:tcPr>
+            <w:tcW w:type="dxa" w:w="5184"/>
+          </w:tcPr>
+          <w:p/>
+        </w:tc>
+      </w:tr>
+      <w:tr>
+        <w:trPr>
+          <w:trHeight w:val="864"/>
+        </w:trPr>
+        <w:tc>
+          <w:tcPr>
+            <w:tcW w:type="dxa" w:w="4608"/>
+          </w:tcPr>
+          <w:p>
+            <w:pPr>
+              <w:spacing w:before="20" w:after="20"/>
+            </w:pPr>
+            <w:r>
+              <w:rPr>
+                <w:rFonts w:ascii="Calibri" w:hAnsi="Calibri"/>
+                <w:b w:val="0"/>
+                <w:i w:val="0"/>
+                <w:sz w:val="19"/>
+              </w:rPr>
+              <w:t>And what is the honest reason you do not have it?</w:t>
+            </w:r>
+          </w:p>
+        </w:tc>
+        <w:tc>
+          <w:tcPr>
+            <w:tcW w:type="dxa" w:w="5184"/>
+          </w:tcPr>
+          <w:p/>
+        </w:tc>
+      </w:tr>
+    </w:tbl>
+    <w:p>
+      <w:pPr>
+        <w:spacing w:after="40"/>
+      </w:pPr>
+    </w:p>
     <w:sectPr>
       <w:headerReference w:type="default" r:id="rId9"/>
       <w:footerReference w:type="default" r:id="rId10"/>

</xml_diff>